<commit_message>
Remove the chunk viewer; keep the extractor fixes it exposed
The viewer was built to inspect chunk boundaries and did its job — it surfaced
three ingestion bugs that the markdown-only CLI runs had hidden. It is removed
now that those are fixed; the page, the preview route, the /ui wiring and
python-multipart all go with it.

Kept, because they are ingestion fixes rather than UI code:
  - HTML emits <h1>..<h6> as markdown headings
  - DOCX maps Word heading styles to markdown headings
  - DOCX walks the body in document order, so a table stays under the heading
    it belongs to instead of being appended after every paragraph

Strategy B now splits html (1 -> 4 chunks) and docx (1 -> 3) as well as
markdown. PDF and txt stay at one chunk: they carry no heading structure to
recover.

Adds GUIDE-CHUNKING.md.

Co-Authored-By: Claude Opus 5 (1M context) <noreply@anthropic.com>
</commit_message>
<xml_diff>
--- a/sample-corpus/v3/reference/client-close.docx
+++ b/sample-corpus/v3/reference/client-close.docx
@@ -12,7 +12,15 @@
     </w:p>
     <w:p>
       <w:r>
-        <w:t>Releases every pooled connection and stops the reaper thread.</w:t>
+        <w:t>Releases every pooled connection and stops the reaper thread. Safe to call more than once; subsequent calls are no-ops.</w:t>
+      </w:r>
+    </w:p>
+    <w:p>
+      <w:pPr>
+        <w:pStyle w:val="Heading2"/>
+      </w:pPr>
+      <w:r>
+        <w:t>Parameters</w:t>
       </w:r>
     </w:p>
     <w:tbl>
@@ -152,7 +160,62 @@
           </w:p>
         </w:tc>
       </w:tr>
+      <w:tr>
+        <w:tc>
+          <w:tcPr>
+            <w:tcW w:type="dxa" w:w="2160"/>
+          </w:tcPr>
+          <w:p>
+            <w:r>
+              <w:t>drain</w:t>
+            </w:r>
+          </w:p>
+        </w:tc>
+        <w:tc>
+          <w:tcPr>
+            <w:tcW w:type="dxa" w:w="2160"/>
+          </w:tcPr>
+          <w:p>
+            <w:r>
+              <w:t>bool</w:t>
+            </w:r>
+          </w:p>
+        </w:tc>
+        <w:tc>
+          <w:tcPr>
+            <w:tcW w:type="dxa" w:w="2160"/>
+          </w:tcPr>
+          <w:p>
+            <w:r>
+              <w:t>True</w:t>
+            </w:r>
+          </w:p>
+        </w:tc>
+        <w:tc>
+          <w:tcPr>
+            <w:tcW w:type="dxa" w:w="2160"/>
+          </w:tcPr>
+          <w:p>
+            <w:r>
+              <w:t>no</w:t>
+            </w:r>
+          </w:p>
+        </w:tc>
+      </w:tr>
     </w:tbl>
+    <w:p>
+      <w:pPr>
+        <w:pStyle w:val="Heading2"/>
+      </w:pPr>
+      <w:r>
+        <w:t>Notes</w:t>
+      </w:r>
+    </w:p>
+    <w:p>
+      <w:r>
+        <w:t>With force=True in-flight requests are cancelled rather than drained. Prefer the default unless the process is shutting down.</w:t>
+      </w:r>
+    </w:p>
     <w:sectPr>
       <w:pgSz w:w="12240" w:h="15840"/>
       <w:pgMar w:top="1440" w:right="1800" w:bottom="1440" w:left="1800" w:header="720" w:footer="720" w:gutter="0"/>

</xml_diff>